<commit_message>
Update diploma and tables' files
</commit_message>
<xml_diff>
--- a/thesis/docs/diplomna-финал.docx
+++ b/thesis/docs/diplomna-финал.docx
@@ -445,8 +445,14 @@
           <w:pPr>
             <w:pStyle w:val="TOCHeading"/>
             <w:spacing w:line="276" w:lineRule="auto"/>
+            <w:rPr>
+              <w:rFonts w:ascii="Times New Roman" w:hAnsi="Times New Roman" w:cs="Times New Roman"/>
+            </w:rPr>
           </w:pPr>
           <w:r>
+            <w:rPr>
+              <w:rFonts w:ascii="Times New Roman" w:hAnsi="Times New Roman" w:cs="Times New Roman"/>
+            </w:rPr>
             <w:t>СЪДЪРЖАНИЕ</w:t>
           </w:r>
         </w:p>
@@ -457,7 +463,7 @@
               <w:tab w:val="right" w:leader="dot" w:pos="9396"/>
             </w:tabs>
             <w:rPr>
-              <w:rFonts w:cstheme="minorBidi"/>
+              <w:rFonts w:ascii="Times New Roman" w:hAnsi="Times New Roman"/>
               <w:kern w:val="2"/>
               <w:sz w:val="24"/>
               <w:szCs w:val="24"/>
@@ -466,59 +472,76 @@
             </w:rPr>
           </w:pPr>
           <w:r>
+            <w:rPr>
+              <w:rFonts w:ascii="Times New Roman" w:hAnsi="Times New Roman"/>
+            </w:rPr>
             <w:fldChar w:fldCharType="begin"/>
           </w:r>
           <w:r>
+            <w:rPr>
+              <w:rFonts w:ascii="Times New Roman" w:hAnsi="Times New Roman"/>
+            </w:rPr>
             <w:instrText xml:space="preserve"> TOC \o "1-3" \h \z \u </w:instrText>
           </w:r>
           <w:r>
+            <w:rPr>
+              <w:rFonts w:ascii="Times New Roman" w:hAnsi="Times New Roman"/>
+            </w:rPr>
             <w:fldChar w:fldCharType="separate"/>
           </w:r>
           <w:hyperlink w:anchor="_Toc227417931" w:history="1">
             <w:r>
               <w:rPr>
                 <w:rStyle w:val="Hyperlink"/>
+                <w:rFonts w:ascii="Times New Roman" w:hAnsi="Times New Roman"/>
                 <w:lang w:bidi="hi-IN"/>
               </w:rPr>
               <w:t>1. УВОД</w:t>
             </w:r>
             <w:r>
               <w:rPr>
+                <w:rFonts w:ascii="Times New Roman" w:hAnsi="Times New Roman"/>
                 <w:webHidden/>
               </w:rPr>
               <w:tab/>
             </w:r>
             <w:r>
               <w:rPr>
+                <w:rFonts w:ascii="Times New Roman" w:hAnsi="Times New Roman"/>
                 <w:webHidden/>
               </w:rPr>
               <w:fldChar w:fldCharType="begin"/>
             </w:r>
             <w:r>
               <w:rPr>
+                <w:rFonts w:ascii="Times New Roman" w:hAnsi="Times New Roman"/>
                 <w:webHidden/>
               </w:rPr>
               <w:instrText xml:space="preserve"> PAGEREF _Toc227417931 \h </w:instrText>
             </w:r>
             <w:r>
               <w:rPr>
+                <w:rFonts w:ascii="Times New Roman" w:hAnsi="Times New Roman"/>
                 <w:webHidden/>
               </w:rPr>
             </w:r>
             <w:r>
               <w:rPr>
+                <w:rFonts w:ascii="Times New Roman" w:hAnsi="Times New Roman"/>
                 <w:webHidden/>
               </w:rPr>
               <w:fldChar w:fldCharType="separate"/>
             </w:r>
             <w:r>
               <w:rPr>
+                <w:rFonts w:ascii="Times New Roman" w:hAnsi="Times New Roman"/>
                 <w:webHidden/>
               </w:rPr>
               <w:t>1</w:t>
             </w:r>
             <w:r>
               <w:rPr>
+                <w:rFonts w:ascii="Times New Roman" w:hAnsi="Times New Roman"/>
                 <w:webHidden/>
               </w:rPr>
               <w:fldChar w:fldCharType="end"/>
@@ -532,7 +555,7 @@
               <w:tab w:val="right" w:leader="dot" w:pos="9396"/>
             </w:tabs>
             <w:rPr>
-              <w:rFonts w:cstheme="minorBidi"/>
+              <w:rFonts w:ascii="Times New Roman" w:hAnsi="Times New Roman"/>
               <w:kern w:val="2"/>
               <w:sz w:val="24"/>
               <w:szCs w:val="24"/>
@@ -544,48 +567,55 @@
             <w:r>
               <w:rPr>
                 <w:rStyle w:val="Hyperlink"/>
-                <w:rFonts w:eastAsia="Times New Roman"/>
+                <w:rFonts w:ascii="Times New Roman" w:eastAsia="Times New Roman" w:hAnsi="Times New Roman"/>
                 <w:lang w:bidi="hi-IN"/>
               </w:rPr>
               <w:t>1.1. Въведение</w:t>
             </w:r>
             <w:r>
               <w:rPr>
+                <w:rFonts w:ascii="Times New Roman" w:hAnsi="Times New Roman"/>
                 <w:webHidden/>
               </w:rPr>
               <w:tab/>
             </w:r>
             <w:r>
               <w:rPr>
+                <w:rFonts w:ascii="Times New Roman" w:hAnsi="Times New Roman"/>
                 <w:webHidden/>
               </w:rPr>
               <w:fldChar w:fldCharType="begin"/>
             </w:r>
             <w:r>
               <w:rPr>
+                <w:rFonts w:ascii="Times New Roman" w:hAnsi="Times New Roman"/>
                 <w:webHidden/>
               </w:rPr>
               <w:instrText xml:space="preserve"> PAGEREF _Toc227417932 \h </w:instrText>
             </w:r>
             <w:r>
               <w:rPr>
+                <w:rFonts w:ascii="Times New Roman" w:hAnsi="Times New Roman"/>
                 <w:webHidden/>
               </w:rPr>
             </w:r>
             <w:r>
               <w:rPr>
+                <w:rFonts w:ascii="Times New Roman" w:hAnsi="Times New Roman"/>
                 <w:webHidden/>
               </w:rPr>
               <w:fldChar w:fldCharType="separate"/>
             </w:r>
             <w:r>
               <w:rPr>
+                <w:rFonts w:ascii="Times New Roman" w:hAnsi="Times New Roman"/>
                 <w:webHidden/>
               </w:rPr>
               <w:t>1</w:t>
             </w:r>
             <w:r>
               <w:rPr>
+                <w:rFonts w:ascii="Times New Roman" w:hAnsi="Times New Roman"/>
                 <w:webHidden/>
               </w:rPr>
               <w:fldChar w:fldCharType="end"/>
@@ -599,7 +629,7 @@
               <w:tab w:val="right" w:leader="dot" w:pos="9396"/>
             </w:tabs>
             <w:rPr>
-              <w:rFonts w:cstheme="minorBidi"/>
+              <w:rFonts w:ascii="Times New Roman" w:hAnsi="Times New Roman"/>
               <w:kern w:val="2"/>
               <w:sz w:val="24"/>
               <w:szCs w:val="24"/>
@@ -611,48 +641,55 @@
             <w:r>
               <w:rPr>
                 <w:rStyle w:val="Hyperlink"/>
-                <w:rFonts w:eastAsia="Times New Roman"/>
+                <w:rFonts w:ascii="Times New Roman" w:eastAsia="Times New Roman" w:hAnsi="Times New Roman"/>
                 <w:lang w:bidi="hi-IN"/>
               </w:rPr>
               <w:t>1.2. Исторически преглед</w:t>
             </w:r>
             <w:r>
               <w:rPr>
+                <w:rFonts w:ascii="Times New Roman" w:hAnsi="Times New Roman"/>
                 <w:webHidden/>
               </w:rPr>
               <w:tab/>
             </w:r>
             <w:r>
               <w:rPr>
+                <w:rFonts w:ascii="Times New Roman" w:hAnsi="Times New Roman"/>
                 <w:webHidden/>
               </w:rPr>
               <w:fldChar w:fldCharType="begin"/>
             </w:r>
             <w:r>
               <w:rPr>
+                <w:rFonts w:ascii="Times New Roman" w:hAnsi="Times New Roman"/>
                 <w:webHidden/>
               </w:rPr>
               <w:instrText xml:space="preserve"> PAGEREF _Toc227417933 \h </w:instrText>
             </w:r>
             <w:r>
               <w:rPr>
+                <w:rFonts w:ascii="Times New Roman" w:hAnsi="Times New Roman"/>
                 <w:webHidden/>
               </w:rPr>
             </w:r>
             <w:r>
               <w:rPr>
+                <w:rFonts w:ascii="Times New Roman" w:hAnsi="Times New Roman"/>
                 <w:webHidden/>
               </w:rPr>
               <w:fldChar w:fldCharType="separate"/>
             </w:r>
             <w:r>
               <w:rPr>
+                <w:rFonts w:ascii="Times New Roman" w:hAnsi="Times New Roman"/>
                 <w:webHidden/>
               </w:rPr>
               <w:t>1</w:t>
             </w:r>
             <w:r>
               <w:rPr>
+                <w:rFonts w:ascii="Times New Roman" w:hAnsi="Times New Roman"/>
                 <w:webHidden/>
               </w:rPr>
               <w:fldChar w:fldCharType="end"/>
@@ -666,7 +703,7 @@
               <w:tab w:val="right" w:leader="dot" w:pos="9396"/>
             </w:tabs>
             <w:rPr>
-              <w:rFonts w:cstheme="minorBidi"/>
+              <w:rFonts w:ascii="Times New Roman" w:hAnsi="Times New Roman"/>
               <w:kern w:val="2"/>
               <w:sz w:val="24"/>
               <w:szCs w:val="24"/>
@@ -678,48 +715,55 @@
             <w:r>
               <w:rPr>
                 <w:rStyle w:val="Hyperlink"/>
-                <w:rFonts w:eastAsia="Times New Roman"/>
+                <w:rFonts w:ascii="Times New Roman" w:eastAsia="Times New Roman" w:hAnsi="Times New Roman"/>
                 <w:lang w:bidi="hi-IN"/>
               </w:rPr>
               <w:t>1.3. Цел и задачи</w:t>
             </w:r>
             <w:r>
               <w:rPr>
+                <w:rFonts w:ascii="Times New Roman" w:hAnsi="Times New Roman"/>
                 <w:webHidden/>
               </w:rPr>
               <w:tab/>
             </w:r>
             <w:r>
               <w:rPr>
+                <w:rFonts w:ascii="Times New Roman" w:hAnsi="Times New Roman"/>
                 <w:webHidden/>
               </w:rPr>
               <w:fldChar w:fldCharType="begin"/>
             </w:r>
             <w:r>
               <w:rPr>
+                <w:rFonts w:ascii="Times New Roman" w:hAnsi="Times New Roman"/>
                 <w:webHidden/>
               </w:rPr>
               <w:instrText xml:space="preserve"> PAGEREF _Toc227417934 \h </w:instrText>
             </w:r>
             <w:r>
               <w:rPr>
+                <w:rFonts w:ascii="Times New Roman" w:hAnsi="Times New Roman"/>
                 <w:webHidden/>
               </w:rPr>
             </w:r>
             <w:r>
               <w:rPr>
+                <w:rFonts w:ascii="Times New Roman" w:hAnsi="Times New Roman"/>
                 <w:webHidden/>
               </w:rPr>
               <w:fldChar w:fldCharType="separate"/>
             </w:r>
             <w:r>
               <w:rPr>
+                <w:rFonts w:ascii="Times New Roman" w:hAnsi="Times New Roman"/>
                 <w:webHidden/>
               </w:rPr>
               <w:t>2</w:t>
             </w:r>
             <w:r>
               <w:rPr>
+                <w:rFonts w:ascii="Times New Roman" w:hAnsi="Times New Roman"/>
                 <w:webHidden/>
               </w:rPr>
               <w:fldChar w:fldCharType="end"/>
@@ -733,7 +777,7 @@
               <w:tab w:val="right" w:leader="dot" w:pos="9396"/>
             </w:tabs>
             <w:rPr>
-              <w:rFonts w:cstheme="minorBidi"/>
+              <w:rFonts w:ascii="Times New Roman" w:hAnsi="Times New Roman"/>
               <w:kern w:val="2"/>
               <w:sz w:val="24"/>
               <w:szCs w:val="24"/>
@@ -745,47 +789,55 @@
             <w:r>
               <w:rPr>
                 <w:rStyle w:val="Hyperlink"/>
+                <w:rFonts w:ascii="Times New Roman" w:hAnsi="Times New Roman"/>
                 <w:lang w:bidi="hi-IN"/>
               </w:rPr>
               <w:t>2. ТЕОРЕТИЧНА ЧАСТ</w:t>
             </w:r>
             <w:r>
               <w:rPr>
+                <w:rFonts w:ascii="Times New Roman" w:hAnsi="Times New Roman"/>
                 <w:webHidden/>
               </w:rPr>
               <w:tab/>
             </w:r>
             <w:r>
               <w:rPr>
+                <w:rFonts w:ascii="Times New Roman" w:hAnsi="Times New Roman"/>
                 <w:webHidden/>
               </w:rPr>
               <w:fldChar w:fldCharType="begin"/>
             </w:r>
             <w:r>
               <w:rPr>
+                <w:rFonts w:ascii="Times New Roman" w:hAnsi="Times New Roman"/>
                 <w:webHidden/>
               </w:rPr>
               <w:instrText xml:space="preserve"> PAGEREF _Toc227417935 \h </w:instrText>
             </w:r>
             <w:r>
               <w:rPr>
+                <w:rFonts w:ascii="Times New Roman" w:hAnsi="Times New Roman"/>
                 <w:webHidden/>
               </w:rPr>
             </w:r>
             <w:r>
               <w:rPr>
+                <w:rFonts w:ascii="Times New Roman" w:hAnsi="Times New Roman"/>
                 <w:webHidden/>
               </w:rPr>
               <w:fldChar w:fldCharType="separate"/>
             </w:r>
             <w:r>
               <w:rPr>
+                <w:rFonts w:ascii="Times New Roman" w:hAnsi="Times New Roman"/>
                 <w:webHidden/>
               </w:rPr>
               <w:t>3</w:t>
             </w:r>
             <w:r>
               <w:rPr>
+                <w:rFonts w:ascii="Times New Roman" w:hAnsi="Times New Roman"/>
                 <w:webHidden/>
               </w:rPr>
               <w:fldChar w:fldCharType="end"/>
@@ -799,7 +851,7 @@
               <w:tab w:val="right" w:leader="dot" w:pos="9396"/>
             </w:tabs>
             <w:rPr>
-              <w:rFonts w:cstheme="minorBidi"/>
+              <w:rFonts w:ascii="Times New Roman" w:hAnsi="Times New Roman"/>
               <w:kern w:val="2"/>
               <w:sz w:val="24"/>
               <w:szCs w:val="24"/>
@@ -811,47 +863,55 @@
             <w:r>
               <w:rPr>
                 <w:rStyle w:val="Hyperlink"/>
+                <w:rFonts w:ascii="Times New Roman" w:hAnsi="Times New Roman"/>
                 <w:lang w:bidi="hi-IN"/>
               </w:rPr>
               <w:t>2.1.1. Видове външни запаметяващи устройства</w:t>
             </w:r>
             <w:r>
               <w:rPr>
+                <w:rFonts w:ascii="Times New Roman" w:hAnsi="Times New Roman"/>
                 <w:webHidden/>
               </w:rPr>
               <w:tab/>
             </w:r>
             <w:r>
               <w:rPr>
+                <w:rFonts w:ascii="Times New Roman" w:hAnsi="Times New Roman"/>
                 <w:webHidden/>
               </w:rPr>
               <w:fldChar w:fldCharType="begin"/>
             </w:r>
             <w:r>
               <w:rPr>
+                <w:rFonts w:ascii="Times New Roman" w:hAnsi="Times New Roman"/>
                 <w:webHidden/>
               </w:rPr>
               <w:instrText xml:space="preserve"> PAGEREF _Toc227417936 \h </w:instrText>
             </w:r>
             <w:r>
               <w:rPr>
+                <w:rFonts w:ascii="Times New Roman" w:hAnsi="Times New Roman"/>
                 <w:webHidden/>
               </w:rPr>
             </w:r>
             <w:r>
               <w:rPr>
+                <w:rFonts w:ascii="Times New Roman" w:hAnsi="Times New Roman"/>
                 <w:webHidden/>
               </w:rPr>
               <w:fldChar w:fldCharType="separate"/>
             </w:r>
             <w:r>
               <w:rPr>
+                <w:rFonts w:ascii="Times New Roman" w:hAnsi="Times New Roman"/>
                 <w:webHidden/>
               </w:rPr>
               <w:t>3</w:t>
             </w:r>
             <w:r>
               <w:rPr>
+                <w:rFonts w:ascii="Times New Roman" w:hAnsi="Times New Roman"/>
                 <w:webHidden/>
               </w:rPr>
               <w:fldChar w:fldCharType="end"/>
@@ -865,7 +925,7 @@
               <w:tab w:val="right" w:leader="dot" w:pos="9396"/>
             </w:tabs>
             <w:rPr>
-              <w:rFonts w:cstheme="minorBidi"/>
+              <w:rFonts w:ascii="Times New Roman" w:hAnsi="Times New Roman"/>
               <w:kern w:val="2"/>
               <w:sz w:val="24"/>
               <w:szCs w:val="24"/>
@@ -877,47 +937,55 @@
             <w:r>
               <w:rPr>
                 <w:rStyle w:val="Hyperlink"/>
+                <w:rFonts w:ascii="Times New Roman" w:hAnsi="Times New Roman"/>
                 <w:lang w:bidi="hi-IN"/>
               </w:rPr>
               <w:t>2.1.2. Технически характеристики на външните носители</w:t>
             </w:r>
             <w:r>
               <w:rPr>
+                <w:rFonts w:ascii="Times New Roman" w:hAnsi="Times New Roman"/>
                 <w:webHidden/>
               </w:rPr>
               <w:tab/>
             </w:r>
             <w:r>
               <w:rPr>
+                <w:rFonts w:ascii="Times New Roman" w:hAnsi="Times New Roman"/>
                 <w:webHidden/>
               </w:rPr>
               <w:fldChar w:fldCharType="begin"/>
             </w:r>
             <w:r>
               <w:rPr>
+                <w:rFonts w:ascii="Times New Roman" w:hAnsi="Times New Roman"/>
                 <w:webHidden/>
               </w:rPr>
               <w:instrText xml:space="preserve"> PAGEREF _Toc227417937 \h </w:instrText>
             </w:r>
             <w:r>
               <w:rPr>
+                <w:rFonts w:ascii="Times New Roman" w:hAnsi="Times New Roman"/>
                 <w:webHidden/>
               </w:rPr>
             </w:r>
             <w:r>
               <w:rPr>
+                <w:rFonts w:ascii="Times New Roman" w:hAnsi="Times New Roman"/>
                 <w:webHidden/>
               </w:rPr>
               <w:fldChar w:fldCharType="separate"/>
             </w:r>
             <w:r>
               <w:rPr>
+                <w:rFonts w:ascii="Times New Roman" w:hAnsi="Times New Roman"/>
                 <w:webHidden/>
               </w:rPr>
               <w:t>7</w:t>
             </w:r>
             <w:r>
               <w:rPr>
+                <w:rFonts w:ascii="Times New Roman" w:hAnsi="Times New Roman"/>
                 <w:webHidden/>
               </w:rPr>
               <w:fldChar w:fldCharType="end"/>
@@ -931,7 +999,7 @@
               <w:tab w:val="right" w:leader="dot" w:pos="9396"/>
             </w:tabs>
             <w:rPr>
-              <w:rFonts w:cstheme="minorBidi"/>
+              <w:rFonts w:ascii="Times New Roman" w:hAnsi="Times New Roman"/>
               <w:kern w:val="2"/>
               <w:sz w:val="24"/>
               <w:szCs w:val="24"/>
@@ -943,47 +1011,55 @@
             <w:r>
               <w:rPr>
                 <w:rStyle w:val="Hyperlink"/>
+                <w:rFonts w:ascii="Times New Roman" w:hAnsi="Times New Roman"/>
                 <w:lang w:bidi="hi-IN"/>
               </w:rPr>
               <w:t>2.1.3. Драйвери и системна интеграция</w:t>
             </w:r>
             <w:r>
               <w:rPr>
+                <w:rFonts w:ascii="Times New Roman" w:hAnsi="Times New Roman"/>
                 <w:webHidden/>
               </w:rPr>
               <w:tab/>
             </w:r>
             <w:r>
               <w:rPr>
+                <w:rFonts w:ascii="Times New Roman" w:hAnsi="Times New Roman"/>
                 <w:webHidden/>
               </w:rPr>
               <w:fldChar w:fldCharType="begin"/>
             </w:r>
             <w:r>
               <w:rPr>
+                <w:rFonts w:ascii="Times New Roman" w:hAnsi="Times New Roman"/>
                 <w:webHidden/>
               </w:rPr>
               <w:instrText xml:space="preserve"> PAGEREF _Toc227417938 \h </w:instrText>
             </w:r>
             <w:r>
               <w:rPr>
+                <w:rFonts w:ascii="Times New Roman" w:hAnsi="Times New Roman"/>
                 <w:webHidden/>
               </w:rPr>
             </w:r>
             <w:r>
               <w:rPr>
+                <w:rFonts w:ascii="Times New Roman" w:hAnsi="Times New Roman"/>
                 <w:webHidden/>
               </w:rPr>
               <w:fldChar w:fldCharType="separate"/>
             </w:r>
             <w:r>
               <w:rPr>
+                <w:rFonts w:ascii="Times New Roman" w:hAnsi="Times New Roman"/>
                 <w:webHidden/>
               </w:rPr>
               <w:t>11</w:t>
             </w:r>
             <w:r>
               <w:rPr>
+                <w:rFonts w:ascii="Times New Roman" w:hAnsi="Times New Roman"/>
                 <w:webHidden/>
               </w:rPr>
               <w:fldChar w:fldCharType="end"/>
@@ -997,7 +1073,7 @@
               <w:tab w:val="right" w:leader="dot" w:pos="9396"/>
             </w:tabs>
             <w:rPr>
-              <w:rFonts w:cstheme="minorBidi"/>
+              <w:rFonts w:ascii="Times New Roman" w:hAnsi="Times New Roman"/>
               <w:kern w:val="2"/>
               <w:sz w:val="24"/>
               <w:szCs w:val="24"/>
@@ -1009,47 +1085,55 @@
             <w:r>
               <w:rPr>
                 <w:rStyle w:val="Hyperlink"/>
+                <w:rFonts w:ascii="Times New Roman" w:hAnsi="Times New Roman"/>
                 <w:lang w:bidi="hi-IN"/>
               </w:rPr>
               <w:t>2.1.4. Сравнителен анализ</w:t>
             </w:r>
             <w:r>
               <w:rPr>
+                <w:rFonts w:ascii="Times New Roman" w:hAnsi="Times New Roman"/>
                 <w:webHidden/>
               </w:rPr>
               <w:tab/>
             </w:r>
             <w:r>
               <w:rPr>
+                <w:rFonts w:ascii="Times New Roman" w:hAnsi="Times New Roman"/>
                 <w:webHidden/>
               </w:rPr>
               <w:fldChar w:fldCharType="begin"/>
             </w:r>
             <w:r>
               <w:rPr>
+                <w:rFonts w:ascii="Times New Roman" w:hAnsi="Times New Roman"/>
                 <w:webHidden/>
               </w:rPr>
               <w:instrText xml:space="preserve"> PAGEREF _Toc227417939 \h </w:instrText>
             </w:r>
             <w:r>
               <w:rPr>
+                <w:rFonts w:ascii="Times New Roman" w:hAnsi="Times New Roman"/>
                 <w:webHidden/>
               </w:rPr>
             </w:r>
             <w:r>
               <w:rPr>
+                <w:rFonts w:ascii="Times New Roman" w:hAnsi="Times New Roman"/>
                 <w:webHidden/>
               </w:rPr>
               <w:fldChar w:fldCharType="separate"/>
             </w:r>
             <w:r>
               <w:rPr>
+                <w:rFonts w:ascii="Times New Roman" w:hAnsi="Times New Roman"/>
                 <w:webHidden/>
               </w:rPr>
               <w:t>14</w:t>
             </w:r>
             <w:r>
               <w:rPr>
+                <w:rFonts w:ascii="Times New Roman" w:hAnsi="Times New Roman"/>
                 <w:webHidden/>
               </w:rPr>
               <w:fldChar w:fldCharType="end"/>
@@ -1063,7 +1147,7 @@
               <w:tab w:val="right" w:leader="dot" w:pos="9396"/>
             </w:tabs>
             <w:rPr>
-              <w:rFonts w:cstheme="minorBidi"/>
+              <w:rFonts w:ascii="Times New Roman" w:hAnsi="Times New Roman"/>
               <w:kern w:val="2"/>
               <w:sz w:val="24"/>
               <w:szCs w:val="24"/>
@@ -1075,47 +1159,55 @@
             <w:r>
               <w:rPr>
                 <w:rStyle w:val="Hyperlink"/>
+                <w:rFonts w:ascii="Times New Roman" w:hAnsi="Times New Roman"/>
                 <w:lang w:bidi="hi-IN"/>
               </w:rPr>
               <w:t>3. ПРАКТИЧЕСКА ЧАСТ</w:t>
             </w:r>
             <w:r>
               <w:rPr>
+                <w:rFonts w:ascii="Times New Roman" w:hAnsi="Times New Roman"/>
                 <w:webHidden/>
               </w:rPr>
               <w:tab/>
             </w:r>
             <w:r>
               <w:rPr>
+                <w:rFonts w:ascii="Times New Roman" w:hAnsi="Times New Roman"/>
                 <w:webHidden/>
               </w:rPr>
               <w:fldChar w:fldCharType="begin"/>
             </w:r>
             <w:r>
               <w:rPr>
+                <w:rFonts w:ascii="Times New Roman" w:hAnsi="Times New Roman"/>
                 <w:webHidden/>
               </w:rPr>
               <w:instrText xml:space="preserve"> PAGEREF _Toc227417940 \h </w:instrText>
             </w:r>
             <w:r>
               <w:rPr>
+                <w:rFonts w:ascii="Times New Roman" w:hAnsi="Times New Roman"/>
                 <w:webHidden/>
               </w:rPr>
             </w:r>
             <w:r>
               <w:rPr>
+                <w:rFonts w:ascii="Times New Roman" w:hAnsi="Times New Roman"/>
                 <w:webHidden/>
               </w:rPr>
               <w:fldChar w:fldCharType="separate"/>
             </w:r>
             <w:r>
               <w:rPr>
+                <w:rFonts w:ascii="Times New Roman" w:hAnsi="Times New Roman"/>
                 <w:webHidden/>
               </w:rPr>
               <w:t>18</w:t>
             </w:r>
             <w:r>
               <w:rPr>
+                <w:rFonts w:ascii="Times New Roman" w:hAnsi="Times New Roman"/>
                 <w:webHidden/>
               </w:rPr>
               <w:fldChar w:fldCharType="end"/>
@@ -1129,7 +1221,7 @@
               <w:tab w:val="right" w:leader="dot" w:pos="9396"/>
             </w:tabs>
             <w:rPr>
-              <w:rFonts w:cstheme="minorBidi"/>
+              <w:rFonts w:ascii="Times New Roman" w:hAnsi="Times New Roman"/>
               <w:kern w:val="2"/>
               <w:sz w:val="24"/>
               <w:szCs w:val="24"/>
@@ -1141,47 +1233,55 @@
             <w:r>
               <w:rPr>
                 <w:rStyle w:val="Hyperlink"/>
+                <w:rFonts w:ascii="Times New Roman" w:hAnsi="Times New Roman"/>
                 <w:lang w:bidi="hi-IN"/>
               </w:rPr>
               <w:t>3.1. Анализ на рисковете при управление на външни носители</w:t>
             </w:r>
             <w:r>
               <w:rPr>
+                <w:rFonts w:ascii="Times New Roman" w:hAnsi="Times New Roman"/>
                 <w:webHidden/>
               </w:rPr>
               <w:tab/>
             </w:r>
             <w:r>
               <w:rPr>
+                <w:rFonts w:ascii="Times New Roman" w:hAnsi="Times New Roman"/>
                 <w:webHidden/>
               </w:rPr>
               <w:fldChar w:fldCharType="begin"/>
             </w:r>
             <w:r>
               <w:rPr>
+                <w:rFonts w:ascii="Times New Roman" w:hAnsi="Times New Roman"/>
                 <w:webHidden/>
               </w:rPr>
               <w:instrText xml:space="preserve"> PAGEREF _Toc227417941 \h </w:instrText>
             </w:r>
             <w:r>
               <w:rPr>
+                <w:rFonts w:ascii="Times New Roman" w:hAnsi="Times New Roman"/>
                 <w:webHidden/>
               </w:rPr>
             </w:r>
             <w:r>
               <w:rPr>
+                <w:rFonts w:ascii="Times New Roman" w:hAnsi="Times New Roman"/>
                 <w:webHidden/>
               </w:rPr>
               <w:fldChar w:fldCharType="separate"/>
             </w:r>
             <w:r>
               <w:rPr>
+                <w:rFonts w:ascii="Times New Roman" w:hAnsi="Times New Roman"/>
                 <w:webHidden/>
               </w:rPr>
               <w:t>19</w:t>
             </w:r>
             <w:r>
               <w:rPr>
+                <w:rFonts w:ascii="Times New Roman" w:hAnsi="Times New Roman"/>
                 <w:webHidden/>
               </w:rPr>
               <w:fldChar w:fldCharType="end"/>
@@ -1195,7 +1295,7 @@
               <w:tab w:val="right" w:leader="dot" w:pos="9396"/>
             </w:tabs>
             <w:rPr>
-              <w:rFonts w:cstheme="minorBidi"/>
+              <w:rFonts w:ascii="Times New Roman" w:hAnsi="Times New Roman"/>
               <w:kern w:val="2"/>
               <w:sz w:val="24"/>
               <w:szCs w:val="24"/>
@@ -1207,47 +1307,55 @@
             <w:r>
               <w:rPr>
                 <w:rStyle w:val="Hyperlink"/>
+                <w:rFonts w:ascii="Times New Roman" w:hAnsi="Times New Roman"/>
                 <w:lang w:bidi="hi-IN"/>
               </w:rPr>
               <w:t>3.2. Мерки за защита на данните</w:t>
             </w:r>
             <w:r>
               <w:rPr>
+                <w:rFonts w:ascii="Times New Roman" w:hAnsi="Times New Roman"/>
                 <w:webHidden/>
               </w:rPr>
               <w:tab/>
             </w:r>
             <w:r>
               <w:rPr>
+                <w:rFonts w:ascii="Times New Roman" w:hAnsi="Times New Roman"/>
                 <w:webHidden/>
               </w:rPr>
               <w:fldChar w:fldCharType="begin"/>
             </w:r>
             <w:r>
               <w:rPr>
+                <w:rFonts w:ascii="Times New Roman" w:hAnsi="Times New Roman"/>
                 <w:webHidden/>
               </w:rPr>
               <w:instrText xml:space="preserve"> PAGEREF _Toc227417942 \h </w:instrText>
             </w:r>
             <w:r>
               <w:rPr>
+                <w:rFonts w:ascii="Times New Roman" w:hAnsi="Times New Roman"/>
                 <w:webHidden/>
               </w:rPr>
             </w:r>
             <w:r>
               <w:rPr>
+                <w:rFonts w:ascii="Times New Roman" w:hAnsi="Times New Roman"/>
                 <w:webHidden/>
               </w:rPr>
               <w:fldChar w:fldCharType="separate"/>
             </w:r>
             <w:r>
               <w:rPr>
+                <w:rFonts w:ascii="Times New Roman" w:hAnsi="Times New Roman"/>
                 <w:webHidden/>
               </w:rPr>
               <w:t>21</w:t>
             </w:r>
             <w:r>
               <w:rPr>
+                <w:rFonts w:ascii="Times New Roman" w:hAnsi="Times New Roman"/>
                 <w:webHidden/>
               </w:rPr>
               <w:fldChar w:fldCharType="end"/>
@@ -1261,7 +1369,7 @@
               <w:tab w:val="right" w:leader="dot" w:pos="9396"/>
             </w:tabs>
             <w:rPr>
-              <w:rFonts w:cstheme="minorBidi"/>
+              <w:rFonts w:ascii="Times New Roman" w:hAnsi="Times New Roman"/>
               <w:kern w:val="2"/>
               <w:sz w:val="24"/>
               <w:szCs w:val="24"/>
@@ -1273,47 +1381,55 @@
             <w:r>
               <w:rPr>
                 <w:rStyle w:val="Hyperlink"/>
+                <w:rFonts w:ascii="Times New Roman" w:hAnsi="Times New Roman"/>
                 <w:lang w:bidi="hi-IN"/>
               </w:rPr>
               <w:t>3.3. Организационна практика в корпоративна среда</w:t>
             </w:r>
             <w:r>
               <w:rPr>
+                <w:rFonts w:ascii="Times New Roman" w:hAnsi="Times New Roman"/>
                 <w:webHidden/>
               </w:rPr>
               <w:tab/>
             </w:r>
             <w:r>
               <w:rPr>
+                <w:rFonts w:ascii="Times New Roman" w:hAnsi="Times New Roman"/>
                 <w:webHidden/>
               </w:rPr>
               <w:fldChar w:fldCharType="begin"/>
             </w:r>
             <w:r>
               <w:rPr>
+                <w:rFonts w:ascii="Times New Roman" w:hAnsi="Times New Roman"/>
                 <w:webHidden/>
               </w:rPr>
               <w:instrText xml:space="preserve"> PAGEREF _Toc227417943 \h </w:instrText>
             </w:r>
             <w:r>
               <w:rPr>
+                <w:rFonts w:ascii="Times New Roman" w:hAnsi="Times New Roman"/>
                 <w:webHidden/>
               </w:rPr>
             </w:r>
             <w:r>
               <w:rPr>
+                <w:rFonts w:ascii="Times New Roman" w:hAnsi="Times New Roman"/>
                 <w:webHidden/>
               </w:rPr>
               <w:fldChar w:fldCharType="separate"/>
             </w:r>
             <w:r>
               <w:rPr>
+                <w:rFonts w:ascii="Times New Roman" w:hAnsi="Times New Roman"/>
                 <w:webHidden/>
               </w:rPr>
               <w:t>27</w:t>
             </w:r>
             <w:r>
               <w:rPr>
+                <w:rFonts w:ascii="Times New Roman" w:hAnsi="Times New Roman"/>
                 <w:webHidden/>
               </w:rPr>
               <w:fldChar w:fldCharType="end"/>
@@ -1327,7 +1443,7 @@
               <w:tab w:val="right" w:leader="dot" w:pos="9396"/>
             </w:tabs>
             <w:rPr>
-              <w:rFonts w:cstheme="minorBidi"/>
+              <w:rFonts w:ascii="Times New Roman" w:hAnsi="Times New Roman"/>
               <w:kern w:val="2"/>
               <w:sz w:val="24"/>
               <w:szCs w:val="24"/>
@@ -1339,47 +1455,55 @@
             <w:r>
               <w:rPr>
                 <w:rStyle w:val="Hyperlink"/>
+                <w:rFonts w:ascii="Times New Roman" w:hAnsi="Times New Roman"/>
                 <w:lang w:bidi="hi-IN"/>
               </w:rPr>
               <w:t>3.4. Практически примери и препоръки</w:t>
             </w:r>
             <w:r>
               <w:rPr>
+                <w:rFonts w:ascii="Times New Roman" w:hAnsi="Times New Roman"/>
                 <w:webHidden/>
               </w:rPr>
               <w:tab/>
             </w:r>
             <w:r>
               <w:rPr>
+                <w:rFonts w:ascii="Times New Roman" w:hAnsi="Times New Roman"/>
                 <w:webHidden/>
               </w:rPr>
               <w:fldChar w:fldCharType="begin"/>
             </w:r>
             <w:r>
               <w:rPr>
+                <w:rFonts w:ascii="Times New Roman" w:hAnsi="Times New Roman"/>
                 <w:webHidden/>
               </w:rPr>
               <w:instrText xml:space="preserve"> PAGEREF _Toc227417944 \h </w:instrText>
             </w:r>
             <w:r>
               <w:rPr>
+                <w:rFonts w:ascii="Times New Roman" w:hAnsi="Times New Roman"/>
                 <w:webHidden/>
               </w:rPr>
             </w:r>
             <w:r>
               <w:rPr>
+                <w:rFonts w:ascii="Times New Roman" w:hAnsi="Times New Roman"/>
                 <w:webHidden/>
               </w:rPr>
               <w:fldChar w:fldCharType="separate"/>
             </w:r>
             <w:r>
               <w:rPr>
+                <w:rFonts w:ascii="Times New Roman" w:hAnsi="Times New Roman"/>
                 <w:webHidden/>
               </w:rPr>
               <w:t>31</w:t>
             </w:r>
             <w:r>
               <w:rPr>
+                <w:rFonts w:ascii="Times New Roman" w:hAnsi="Times New Roman"/>
                 <w:webHidden/>
               </w:rPr>
               <w:fldChar w:fldCharType="end"/>
@@ -1393,7 +1517,7 @@
               <w:tab w:val="right" w:leader="dot" w:pos="9396"/>
             </w:tabs>
             <w:rPr>
-              <w:rFonts w:cstheme="minorBidi"/>
+              <w:rFonts w:ascii="Times New Roman" w:hAnsi="Times New Roman"/>
               <w:kern w:val="2"/>
               <w:sz w:val="24"/>
               <w:szCs w:val="24"/>
@@ -1405,47 +1529,55 @@
             <w:r>
               <w:rPr>
                 <w:rStyle w:val="Hyperlink"/>
+                <w:rFonts w:ascii="Times New Roman" w:hAnsi="Times New Roman"/>
                 <w:lang w:bidi="hi-IN"/>
               </w:rPr>
               <w:t>3.5. Сравнителен анализ на решения за защита на външни носители</w:t>
             </w:r>
             <w:r>
               <w:rPr>
+                <w:rFonts w:ascii="Times New Roman" w:hAnsi="Times New Roman"/>
                 <w:webHidden/>
               </w:rPr>
               <w:tab/>
             </w:r>
             <w:r>
               <w:rPr>
+                <w:rFonts w:ascii="Times New Roman" w:hAnsi="Times New Roman"/>
                 <w:webHidden/>
               </w:rPr>
               <w:fldChar w:fldCharType="begin"/>
             </w:r>
             <w:r>
               <w:rPr>
+                <w:rFonts w:ascii="Times New Roman" w:hAnsi="Times New Roman"/>
                 <w:webHidden/>
               </w:rPr>
               <w:instrText xml:space="preserve"> PAGEREF _Toc227417945 \h </w:instrText>
             </w:r>
             <w:r>
               <w:rPr>
+                <w:rFonts w:ascii="Times New Roman" w:hAnsi="Times New Roman"/>
                 <w:webHidden/>
               </w:rPr>
             </w:r>
             <w:r>
               <w:rPr>
+                <w:rFonts w:ascii="Times New Roman" w:hAnsi="Times New Roman"/>
                 <w:webHidden/>
               </w:rPr>
               <w:fldChar w:fldCharType="separate"/>
             </w:r>
             <w:r>
               <w:rPr>
+                <w:rFonts w:ascii="Times New Roman" w:hAnsi="Times New Roman"/>
                 <w:webHidden/>
               </w:rPr>
               <w:t>34</w:t>
             </w:r>
             <w:r>
               <w:rPr>
+                <w:rFonts w:ascii="Times New Roman" w:hAnsi="Times New Roman"/>
                 <w:webHidden/>
               </w:rPr>
               <w:fldChar w:fldCharType="end"/>
@@ -1459,7 +1591,7 @@
               <w:tab w:val="right" w:leader="dot" w:pos="9396"/>
             </w:tabs>
             <w:rPr>
-              <w:rFonts w:cstheme="minorBidi"/>
+              <w:rFonts w:ascii="Times New Roman" w:hAnsi="Times New Roman"/>
               <w:kern w:val="2"/>
               <w:sz w:val="24"/>
               <w:szCs w:val="24"/>
@@ -1471,47 +1603,55 @@
             <w:r>
               <w:rPr>
                 <w:rStyle w:val="Hyperlink"/>
+                <w:rFonts w:ascii="Times New Roman" w:hAnsi="Times New Roman"/>
                 <w:lang w:bidi="hi-IN"/>
               </w:rPr>
-              <w:t>3.6. Практическа демонстрация: GPO контрол и BitLocker To Go в среда на Active Directory</w:t>
-            </w:r>
-            <w:r>
-              <w:rPr>
+              <w:t>3.6. Практическа демонстрация</w:t>
+            </w:r>
+            <w:r>
+              <w:rPr>
+                <w:rFonts w:ascii="Times New Roman" w:hAnsi="Times New Roman"/>
                 <w:webHidden/>
               </w:rPr>
               <w:tab/>
             </w:r>
             <w:r>
               <w:rPr>
+                <w:rFonts w:ascii="Times New Roman" w:hAnsi="Times New Roman"/>
                 <w:webHidden/>
               </w:rPr>
               <w:fldChar w:fldCharType="begin"/>
             </w:r>
             <w:r>
               <w:rPr>
+                <w:rFonts w:ascii="Times New Roman" w:hAnsi="Times New Roman"/>
                 <w:webHidden/>
               </w:rPr>
               <w:instrText xml:space="preserve"> PAGEREF _Toc227417946 \h </w:instrText>
             </w:r>
             <w:r>
               <w:rPr>
+                <w:rFonts w:ascii="Times New Roman" w:hAnsi="Times New Roman"/>
                 <w:webHidden/>
               </w:rPr>
             </w:r>
             <w:r>
               <w:rPr>
+                <w:rFonts w:ascii="Times New Roman" w:hAnsi="Times New Roman"/>
                 <w:webHidden/>
               </w:rPr>
               <w:fldChar w:fldCharType="separate"/>
             </w:r>
             <w:r>
               <w:rPr>
+                <w:rFonts w:ascii="Times New Roman" w:hAnsi="Times New Roman"/>
                 <w:webHidden/>
               </w:rPr>
               <w:t>36</w:t>
             </w:r>
             <w:r>
               <w:rPr>
+                <w:rFonts w:ascii="Times New Roman" w:hAnsi="Times New Roman"/>
                 <w:webHidden/>
               </w:rPr>
               <w:fldChar w:fldCharType="end"/>
@@ -1525,7 +1665,7 @@
               <w:tab w:val="right" w:leader="dot" w:pos="9396"/>
             </w:tabs>
             <w:rPr>
-              <w:rFonts w:cstheme="minorBidi"/>
+              <w:rFonts w:ascii="Times New Roman" w:hAnsi="Times New Roman"/>
               <w:kern w:val="2"/>
               <w:sz w:val="24"/>
               <w:szCs w:val="24"/>
@@ -1537,47 +1677,55 @@
             <w:r>
               <w:rPr>
                 <w:rStyle w:val="Hyperlink"/>
+                <w:rFonts w:ascii="Times New Roman" w:hAnsi="Times New Roman"/>
                 <w:lang w:bidi="hi-IN"/>
               </w:rPr>
               <w:t>4. ЗАКЛЮЧЕНИЕ</w:t>
             </w:r>
             <w:r>
               <w:rPr>
+                <w:rFonts w:ascii="Times New Roman" w:hAnsi="Times New Roman"/>
                 <w:webHidden/>
               </w:rPr>
               <w:tab/>
             </w:r>
             <w:r>
               <w:rPr>
+                <w:rFonts w:ascii="Times New Roman" w:hAnsi="Times New Roman"/>
                 <w:webHidden/>
               </w:rPr>
               <w:fldChar w:fldCharType="begin"/>
             </w:r>
             <w:r>
               <w:rPr>
+                <w:rFonts w:ascii="Times New Roman" w:hAnsi="Times New Roman"/>
                 <w:webHidden/>
               </w:rPr>
               <w:instrText xml:space="preserve"> PAGEREF _Toc227417947 \h </w:instrText>
             </w:r>
             <w:r>
               <w:rPr>
+                <w:rFonts w:ascii="Times New Roman" w:hAnsi="Times New Roman"/>
                 <w:webHidden/>
               </w:rPr>
             </w:r>
             <w:r>
               <w:rPr>
+                <w:rFonts w:ascii="Times New Roman" w:hAnsi="Times New Roman"/>
                 <w:webHidden/>
               </w:rPr>
               <w:fldChar w:fldCharType="separate"/>
             </w:r>
             <w:r>
               <w:rPr>
+                <w:rFonts w:ascii="Times New Roman" w:hAnsi="Times New Roman"/>
                 <w:webHidden/>
               </w:rPr>
               <w:t>40</w:t>
             </w:r>
             <w:r>
               <w:rPr>
+                <w:rFonts w:ascii="Times New Roman" w:hAnsi="Times New Roman"/>
                 <w:webHidden/>
               </w:rPr>
               <w:fldChar w:fldCharType="end"/>
@@ -1591,7 +1739,7 @@
               <w:tab w:val="right" w:leader="dot" w:pos="9396"/>
             </w:tabs>
             <w:rPr>
-              <w:rFonts w:cstheme="minorBidi"/>
+              <w:rFonts w:ascii="Times New Roman" w:hAnsi="Times New Roman"/>
               <w:kern w:val="2"/>
               <w:sz w:val="24"/>
               <w:szCs w:val="24"/>
@@ -1603,47 +1751,55 @@
             <w:r>
               <w:rPr>
                 <w:rStyle w:val="Hyperlink"/>
+                <w:rFonts w:ascii="Times New Roman" w:hAnsi="Times New Roman"/>
                 <w:lang w:bidi="hi-IN"/>
               </w:rPr>
               <w:t>5. ПРИНОСИ</w:t>
             </w:r>
             <w:r>
               <w:rPr>
+                <w:rFonts w:ascii="Times New Roman" w:hAnsi="Times New Roman"/>
                 <w:webHidden/>
               </w:rPr>
               <w:tab/>
             </w:r>
             <w:r>
               <w:rPr>
+                <w:rFonts w:ascii="Times New Roman" w:hAnsi="Times New Roman"/>
                 <w:webHidden/>
               </w:rPr>
               <w:fldChar w:fldCharType="begin"/>
             </w:r>
             <w:r>
               <w:rPr>
+                <w:rFonts w:ascii="Times New Roman" w:hAnsi="Times New Roman"/>
                 <w:webHidden/>
               </w:rPr>
               <w:instrText xml:space="preserve"> PAGEREF _Toc227417948 \h </w:instrText>
             </w:r>
             <w:r>
               <w:rPr>
+                <w:rFonts w:ascii="Times New Roman" w:hAnsi="Times New Roman"/>
                 <w:webHidden/>
               </w:rPr>
             </w:r>
             <w:r>
               <w:rPr>
+                <w:rFonts w:ascii="Times New Roman" w:hAnsi="Times New Roman"/>
                 <w:webHidden/>
               </w:rPr>
               <w:fldChar w:fldCharType="separate"/>
             </w:r>
             <w:r>
               <w:rPr>
+                <w:rFonts w:ascii="Times New Roman" w:hAnsi="Times New Roman"/>
                 <w:webHidden/>
               </w:rPr>
               <w:t>43</w:t>
             </w:r>
             <w:r>
               <w:rPr>
+                <w:rFonts w:ascii="Times New Roman" w:hAnsi="Times New Roman"/>
                 <w:webHidden/>
               </w:rPr>
               <w:fldChar w:fldCharType="end"/>
@@ -1657,7 +1813,7 @@
               <w:tab w:val="right" w:leader="dot" w:pos="9396"/>
             </w:tabs>
             <w:rPr>
-              <w:rFonts w:cstheme="minorBidi"/>
+              <w:rFonts w:ascii="Times New Roman" w:hAnsi="Times New Roman"/>
               <w:kern w:val="2"/>
               <w:sz w:val="24"/>
               <w:szCs w:val="24"/>
@@ -1669,47 +1825,55 @@
             <w:r>
               <w:rPr>
                 <w:rStyle w:val="Hyperlink"/>
+                <w:rFonts w:ascii="Times New Roman" w:hAnsi="Times New Roman"/>
                 <w:lang w:bidi="hi-IN"/>
               </w:rPr>
               <w:t>6. ПРИЛОЖЕНИЯ</w:t>
             </w:r>
             <w:r>
               <w:rPr>
+                <w:rFonts w:ascii="Times New Roman" w:hAnsi="Times New Roman"/>
                 <w:webHidden/>
               </w:rPr>
               <w:tab/>
             </w:r>
             <w:r>
               <w:rPr>
+                <w:rFonts w:ascii="Times New Roman" w:hAnsi="Times New Roman"/>
                 <w:webHidden/>
               </w:rPr>
               <w:fldChar w:fldCharType="begin"/>
             </w:r>
             <w:r>
               <w:rPr>
+                <w:rFonts w:ascii="Times New Roman" w:hAnsi="Times New Roman"/>
                 <w:webHidden/>
               </w:rPr>
               <w:instrText xml:space="preserve"> PAGEREF _Toc227417949 \h </w:instrText>
             </w:r>
             <w:r>
               <w:rPr>
+                <w:rFonts w:ascii="Times New Roman" w:hAnsi="Times New Roman"/>
                 <w:webHidden/>
               </w:rPr>
             </w:r>
             <w:r>
               <w:rPr>
+                <w:rFonts w:ascii="Times New Roman" w:hAnsi="Times New Roman"/>
                 <w:webHidden/>
               </w:rPr>
               <w:fldChar w:fldCharType="separate"/>
             </w:r>
             <w:r>
               <w:rPr>
+                <w:rFonts w:ascii="Times New Roman" w:hAnsi="Times New Roman"/>
                 <w:webHidden/>
               </w:rPr>
               <w:t>45</w:t>
             </w:r>
             <w:r>
               <w:rPr>
+                <w:rFonts w:ascii="Times New Roman" w:hAnsi="Times New Roman"/>
                 <w:webHidden/>
               </w:rPr>
               <w:fldChar w:fldCharType="end"/>
@@ -1723,7 +1887,7 @@
               <w:tab w:val="right" w:leader="dot" w:pos="9396"/>
             </w:tabs>
             <w:rPr>
-              <w:rFonts w:cstheme="minorBidi"/>
+              <w:rFonts w:ascii="Times New Roman" w:hAnsi="Times New Roman"/>
               <w:kern w:val="2"/>
               <w:sz w:val="24"/>
               <w:szCs w:val="24"/>
@@ -1735,47 +1899,55 @@
             <w:r>
               <w:rPr>
                 <w:rStyle w:val="Hyperlink"/>
+                <w:rFonts w:ascii="Times New Roman" w:hAnsi="Times New Roman"/>
                 <w:lang w:bidi="hi-IN"/>
               </w:rPr>
-              <w:t>Приложение А. Примерна конфигурация на Device Control Policy (Microsoft Defender for Endpoint)</w:t>
-            </w:r>
-            <w:r>
-              <w:rPr>
+              <w:t>Приложение А. Примерна конфигурация на Device Control Policy</w:t>
+            </w:r>
+            <w:r>
+              <w:rPr>
+                <w:rFonts w:ascii="Times New Roman" w:hAnsi="Times New Roman"/>
                 <w:webHidden/>
               </w:rPr>
               <w:tab/>
             </w:r>
             <w:r>
               <w:rPr>
+                <w:rFonts w:ascii="Times New Roman" w:hAnsi="Times New Roman"/>
                 <w:webHidden/>
               </w:rPr>
               <w:fldChar w:fldCharType="begin"/>
             </w:r>
             <w:r>
               <w:rPr>
+                <w:rFonts w:ascii="Times New Roman" w:hAnsi="Times New Roman"/>
                 <w:webHidden/>
               </w:rPr>
               <w:instrText xml:space="preserve"> PAGEREF _Toc227417950 \h </w:instrText>
             </w:r>
             <w:r>
               <w:rPr>
+                <w:rFonts w:ascii="Times New Roman" w:hAnsi="Times New Roman"/>
                 <w:webHidden/>
               </w:rPr>
             </w:r>
             <w:r>
               <w:rPr>
+                <w:rFonts w:ascii="Times New Roman" w:hAnsi="Times New Roman"/>
                 <w:webHidden/>
               </w:rPr>
               <w:fldChar w:fldCharType="separate"/>
             </w:r>
             <w:r>
               <w:rPr>
+                <w:rFonts w:ascii="Times New Roman" w:hAnsi="Times New Roman"/>
                 <w:webHidden/>
               </w:rPr>
               <w:t>45</w:t>
             </w:r>
             <w:r>
               <w:rPr>
+                <w:rFonts w:ascii="Times New Roman" w:hAnsi="Times New Roman"/>
                 <w:webHidden/>
               </w:rPr>
               <w:fldChar w:fldCharType="end"/>
@@ -1789,7 +1961,7 @@
               <w:tab w:val="right" w:leader="dot" w:pos="9396"/>
             </w:tabs>
             <w:rPr>
-              <w:rFonts w:cstheme="minorBidi"/>
+              <w:rFonts w:ascii="Times New Roman" w:hAnsi="Times New Roman"/>
               <w:kern w:val="2"/>
               <w:sz w:val="24"/>
               <w:szCs w:val="24"/>
@@ -1801,47 +1973,55 @@
             <w:r>
               <w:rPr>
                 <w:rStyle w:val="Hyperlink"/>
+                <w:rFonts w:ascii="Times New Roman" w:hAnsi="Times New Roman"/>
                 <w:lang w:bidi="hi-IN"/>
               </w:rPr>
               <w:t>Приложение Б. Примерна GPO конфигурация за контрол на преносими устройства</w:t>
             </w:r>
             <w:r>
               <w:rPr>
+                <w:rFonts w:ascii="Times New Roman" w:hAnsi="Times New Roman"/>
                 <w:webHidden/>
               </w:rPr>
               <w:tab/>
             </w:r>
             <w:r>
               <w:rPr>
+                <w:rFonts w:ascii="Times New Roman" w:hAnsi="Times New Roman"/>
                 <w:webHidden/>
               </w:rPr>
               <w:fldChar w:fldCharType="begin"/>
             </w:r>
             <w:r>
               <w:rPr>
+                <w:rFonts w:ascii="Times New Roman" w:hAnsi="Times New Roman"/>
                 <w:webHidden/>
               </w:rPr>
               <w:instrText xml:space="preserve"> PAGEREF _Toc227417951 \h </w:instrText>
             </w:r>
             <w:r>
               <w:rPr>
+                <w:rFonts w:ascii="Times New Roman" w:hAnsi="Times New Roman"/>
                 <w:webHidden/>
               </w:rPr>
             </w:r>
             <w:r>
               <w:rPr>
+                <w:rFonts w:ascii="Times New Roman" w:hAnsi="Times New Roman"/>
                 <w:webHidden/>
               </w:rPr>
               <w:fldChar w:fldCharType="separate"/>
             </w:r>
             <w:r>
               <w:rPr>
+                <w:rFonts w:ascii="Times New Roman" w:hAnsi="Times New Roman"/>
                 <w:webHidden/>
               </w:rPr>
               <w:t>46</w:t>
             </w:r>
             <w:r>
               <w:rPr>
+                <w:rFonts w:ascii="Times New Roman" w:hAnsi="Times New Roman"/>
                 <w:webHidden/>
               </w:rPr>
               <w:fldChar w:fldCharType="end"/>
@@ -1855,7 +2035,7 @@
               <w:tab w:val="right" w:leader="dot" w:pos="9396"/>
             </w:tabs>
             <w:rPr>
-              <w:rFonts w:cstheme="minorBidi"/>
+              <w:rFonts w:ascii="Times New Roman" w:hAnsi="Times New Roman"/>
               <w:kern w:val="2"/>
               <w:sz w:val="24"/>
               <w:szCs w:val="24"/>
@@ -1867,47 +2047,55 @@
             <w:r>
               <w:rPr>
                 <w:rStyle w:val="Hyperlink"/>
+                <w:rFonts w:ascii="Times New Roman" w:hAnsi="Times New Roman"/>
                 <w:lang w:bidi="hi-IN"/>
               </w:rPr>
               <w:t>Приложение В. Шаблон за инвентаризация на USB устройства</w:t>
             </w:r>
             <w:r>
               <w:rPr>
+                <w:rFonts w:ascii="Times New Roman" w:hAnsi="Times New Roman"/>
                 <w:webHidden/>
               </w:rPr>
               <w:tab/>
             </w:r>
             <w:r>
               <w:rPr>
+                <w:rFonts w:ascii="Times New Roman" w:hAnsi="Times New Roman"/>
                 <w:webHidden/>
               </w:rPr>
               <w:fldChar w:fldCharType="begin"/>
             </w:r>
             <w:r>
               <w:rPr>
+                <w:rFonts w:ascii="Times New Roman" w:hAnsi="Times New Roman"/>
                 <w:webHidden/>
               </w:rPr>
               <w:instrText xml:space="preserve"> PAGEREF _Toc227417952 \h </w:instrText>
             </w:r>
             <w:r>
               <w:rPr>
+                <w:rFonts w:ascii="Times New Roman" w:hAnsi="Times New Roman"/>
                 <w:webHidden/>
               </w:rPr>
             </w:r>
             <w:r>
               <w:rPr>
+                <w:rFonts w:ascii="Times New Roman" w:hAnsi="Times New Roman"/>
                 <w:webHidden/>
               </w:rPr>
               <w:fldChar w:fldCharType="separate"/>
             </w:r>
             <w:r>
               <w:rPr>
+                <w:rFonts w:ascii="Times New Roman" w:hAnsi="Times New Roman"/>
                 <w:webHidden/>
               </w:rPr>
               <w:t>48</w:t>
             </w:r>
             <w:r>
               <w:rPr>
+                <w:rFonts w:ascii="Times New Roman" w:hAnsi="Times New Roman"/>
                 <w:webHidden/>
               </w:rPr>
               <w:fldChar w:fldCharType="end"/>
@@ -1921,7 +2109,7 @@
               <w:tab w:val="right" w:leader="dot" w:pos="9396"/>
             </w:tabs>
             <w:rPr>
-              <w:rFonts w:cstheme="minorBidi"/>
+              <w:rFonts w:ascii="Times New Roman" w:hAnsi="Times New Roman"/>
               <w:kern w:val="2"/>
               <w:sz w:val="24"/>
               <w:szCs w:val="24"/>
@@ -1933,47 +2121,55 @@
             <w:r>
               <w:rPr>
                 <w:rStyle w:val="Hyperlink"/>
+                <w:rFonts w:ascii="Times New Roman" w:hAnsi="Times New Roman"/>
                 <w:lang w:bidi="hi-IN"/>
               </w:rPr>
               <w:t>Приложение Г. Чеклист за сигурно изтриване на данни по NIST SP 800-88 Rev. 1</w:t>
             </w:r>
             <w:r>
               <w:rPr>
+                <w:rFonts w:ascii="Times New Roman" w:hAnsi="Times New Roman"/>
                 <w:webHidden/>
               </w:rPr>
               <w:tab/>
             </w:r>
             <w:r>
               <w:rPr>
+                <w:rFonts w:ascii="Times New Roman" w:hAnsi="Times New Roman"/>
                 <w:webHidden/>
               </w:rPr>
               <w:fldChar w:fldCharType="begin"/>
             </w:r>
             <w:r>
               <w:rPr>
+                <w:rFonts w:ascii="Times New Roman" w:hAnsi="Times New Roman"/>
                 <w:webHidden/>
               </w:rPr>
               <w:instrText xml:space="preserve"> PAGEREF _Toc227417953 \h </w:instrText>
             </w:r>
             <w:r>
               <w:rPr>
+                <w:rFonts w:ascii="Times New Roman" w:hAnsi="Times New Roman"/>
                 <w:webHidden/>
               </w:rPr>
             </w:r>
             <w:r>
               <w:rPr>
+                <w:rFonts w:ascii="Times New Roman" w:hAnsi="Times New Roman"/>
                 <w:webHidden/>
               </w:rPr>
               <w:fldChar w:fldCharType="separate"/>
             </w:r>
             <w:r>
               <w:rPr>
+                <w:rFonts w:ascii="Times New Roman" w:hAnsi="Times New Roman"/>
                 <w:webHidden/>
               </w:rPr>
               <w:t>49</w:t>
             </w:r>
             <w:r>
               <w:rPr>
+                <w:rFonts w:ascii="Times New Roman" w:hAnsi="Times New Roman"/>
                 <w:webHidden/>
               </w:rPr>
               <w:fldChar w:fldCharType="end"/>
@@ -1987,7 +2183,7 @@
               <w:tab w:val="right" w:leader="dot" w:pos="9396"/>
             </w:tabs>
             <w:rPr>
-              <w:rFonts w:cstheme="minorBidi"/>
+              <w:rFonts w:ascii="Times New Roman" w:hAnsi="Times New Roman"/>
               <w:kern w:val="2"/>
               <w:sz w:val="24"/>
               <w:szCs w:val="24"/>
@@ -1999,47 +2195,55 @@
             <w:r>
               <w:rPr>
                 <w:rStyle w:val="Hyperlink"/>
+                <w:rFonts w:ascii="Times New Roman" w:hAnsi="Times New Roman"/>
                 <w:lang w:bidi="hi-IN"/>
               </w:rPr>
               <w:t>7. ЛИТЕРАТУРА</w:t>
             </w:r>
             <w:r>
               <w:rPr>
+                <w:rFonts w:ascii="Times New Roman" w:hAnsi="Times New Roman"/>
                 <w:webHidden/>
               </w:rPr>
               <w:tab/>
             </w:r>
             <w:r>
               <w:rPr>
+                <w:rFonts w:ascii="Times New Roman" w:hAnsi="Times New Roman"/>
                 <w:webHidden/>
               </w:rPr>
               <w:fldChar w:fldCharType="begin"/>
             </w:r>
             <w:r>
               <w:rPr>
+                <w:rFonts w:ascii="Times New Roman" w:hAnsi="Times New Roman"/>
                 <w:webHidden/>
               </w:rPr>
               <w:instrText xml:space="preserve"> PAGEREF _Toc227417954 \h </w:instrText>
             </w:r>
             <w:r>
               <w:rPr>
+                <w:rFonts w:ascii="Times New Roman" w:hAnsi="Times New Roman"/>
                 <w:webHidden/>
               </w:rPr>
             </w:r>
             <w:r>
               <w:rPr>
+                <w:rFonts w:ascii="Times New Roman" w:hAnsi="Times New Roman"/>
                 <w:webHidden/>
               </w:rPr>
               <w:fldChar w:fldCharType="separate"/>
             </w:r>
             <w:r>
               <w:rPr>
+                <w:rFonts w:ascii="Times New Roman" w:hAnsi="Times New Roman"/>
                 <w:webHidden/>
               </w:rPr>
               <w:t>52</w:t>
             </w:r>
             <w:r>
               <w:rPr>
+                <w:rFonts w:ascii="Times New Roman" w:hAnsi="Times New Roman"/>
                 <w:webHidden/>
               </w:rPr>
               <w:fldChar w:fldCharType="end"/>
@@ -23866,7 +24070,7 @@
                 <w:lang w:val="bg-BG"/>
               </w:rPr>
               <w:drawing>
-                <wp:inline distT="0" distB="0" distL="0" distR="0" wp14:anchorId="76E0B9B1" wp14:editId="30BBCD79">
+                <wp:inline distT="0" distB="0" distL="0" distR="0" wp14:anchorId="76E0B9B1" wp14:editId="3F56E70C">
                   <wp:extent cx="2683824" cy="1336675"/>
                   <wp:effectExtent l="0" t="0" r="2540" b="0"/>
                   <wp:docPr id="1965569053" name="Picture 8"/>
@@ -23948,7 +24152,7 @@
                 <w:lang w:val="bg-BG"/>
               </w:rPr>
               <w:drawing>
-                <wp:inline distT="0" distB="0" distL="0" distR="0" wp14:anchorId="223B7CF8" wp14:editId="14D7AAB0">
+                <wp:inline distT="0" distB="0" distL="0" distR="0" wp14:anchorId="223B7CF8" wp14:editId="5295291C">
                   <wp:extent cx="2767519" cy="1345721"/>
                   <wp:effectExtent l="0" t="0" r="0" b="6985"/>
                   <wp:docPr id="1076484189" name="Picture 9"/>
@@ -26403,7 +26607,7 @@
           <w:lang w:val="bg-BG"/>
         </w:rPr>
         <w:drawing>
-          <wp:inline distT="0" distB="0" distL="0" distR="0" wp14:anchorId="4AC313DD" wp14:editId="24BA2985">
+          <wp:inline distT="0" distB="0" distL="0" distR="0" wp14:anchorId="4AC313DD" wp14:editId="1098D7A2">
             <wp:extent cx="3120518" cy="2286132"/>
             <wp:effectExtent l="0" t="0" r="3810" b="0"/>
             <wp:docPr id="170855409" name="Picture 10"/>
@@ -32286,9 +32490,6 @@
     <w:pPr>
       <w:pStyle w:val="normal1"/>
       <w:jc w:val="right"/>
-      <w:rPr>
-        <w:lang w:val="bg-BG"/>
-      </w:rPr>
     </w:pPr>
     <w:r>
       <w:rPr>
@@ -32408,15 +32609,98 @@
 <file path=word/header2.xml><?xml version="1.0" encoding="utf-8"?>
 <w:hdr xmlns:wpc="http://schemas.microsoft.com/office/word/2010/wordprocessingCanvas" xmlns:cx="http://schemas.microsoft.com/office/drawing/2014/chartex" xmlns:cx1="http://schemas.microsoft.com/office/drawing/2015/9/8/chartex" xmlns:cx2="http://schemas.microsoft.com/office/drawing/2015/10/21/chartex" xmlns:cx3="http://schemas.microsoft.com/office/drawing/2016/5/9/chartex" xmlns:cx4="http://schemas.microsoft.com/office/drawing/2016/5/10/chartex" xmlns:cx5="http://schemas.microsoft.com/office/drawing/2016/5/11/chartex" xmlns:cx6="http://schemas.microsoft.com/office/drawing/2016/5/12/chartex" xmlns:cx7="http://schemas.microsoft.com/office/drawing/2016/5/13/chartex" xmlns:cx8="http://schemas.microsoft.com/office/drawing/2016/5/14/chartex" xmlns:mc="http://schemas.openxmlformats.org/markup-compatibility/2006" xmlns:aink="http://schemas.microsoft.com/office/drawing/2016/ink" xmlns:am3d="http://schemas.microsoft.com/office/drawing/2017/model3d" xmlns:o="urn:schemas-microsoft-com:office:office" xmlns:oel="http://schemas.microsoft.com/office/2019/extlst" xmlns:r="http://schemas.openxmlformats.org/officeDocument/2006/relationships" xmlns:m="http://schemas.openxmlformats.org/officeDocument/2006/math" xmlns:v="urn:schemas-microsoft-com:vml" xmlns:wp14="http://schemas.microsoft.com/office/word/2010/wordprocessingDrawing" xmlns:wp="http://schemas.openxmlformats.org/drawingml/2006/wordprocessingDrawing" xmlns:w10="urn:schemas-microsoft-com:office:word" xmlns:w="http://schemas.openxmlformats.org/wordprocessingml/2006/main" xmlns:w14="http://schemas.microsoft.com/office/word/2010/wordml" xmlns:w15="http://schemas.microsoft.com/office/word/2012/wordml" xmlns:w16cex="http://schemas.microsoft.com/office/word/2018/wordml/cex" xmlns:w16cid="http://schemas.microsoft.com/office/word/2016/wordml/cid" xmlns:w16="http://schemas.microsoft.com/office/word/2018/wordml" xmlns:w16du="http://schemas.microsoft.com/office/word/2023/wordml/word16du" xmlns:w16sdtdh="http://schemas.microsoft.com/office/word/2020/wordml/sdtdatahash" xmlns:w16sdtfl="http://schemas.microsoft.com/office/word/2024/wordml/sdtformatlock" xmlns:w16se="http://schemas.microsoft.com/office/word/2015/wordml/symex" xmlns:wpg="http://schemas.microsoft.com/office/word/2010/wordprocessingGroup" xmlns:wpi="http://schemas.microsoft.com/office/word/2010/wordprocessingInk" xmlns:wne="http://schemas.microsoft.com/office/word/2006/wordml" xmlns:wps="http://schemas.microsoft.com/office/word/2010/wordprocessingShape" mc:Ignorable="w14 w15 w16se w16cid w16 w16cex w16sdtdh w16sdtfl w16du wp14">
   <w:p>
+    <w:pPr>
+      <w:jc w:val="center"/>
+      <w:rPr>
+        <w:b/>
+        <w:sz w:val="26"/>
+        <w:szCs w:val="26"/>
+        <w:lang w:val="en-US"/>
+      </w:rPr>
+    </w:pPr>
     <w:r>
+      <w:rPr>
+        <w:b/>
+        <w:sz w:val="26"/>
+        <w:szCs w:val="26"/>
+        <w:u w:val="single"/>
+      </w:rPr>
       <w:drawing>
-        <wp:anchor distT="114300" distB="114300" distL="114300" distR="114300" simplePos="0" relativeHeight="251659264" behindDoc="0" locked="0" layoutInCell="1" hidden="0" allowOverlap="1" wp14:anchorId="2ECF29DA" wp14:editId="5C856F21">
+        <wp:anchor distT="0" distB="0" distL="114300" distR="114300" simplePos="0" relativeHeight="251660288" behindDoc="0" locked="0" layoutInCell="1" allowOverlap="1" wp14:anchorId="0CA0A3F8" wp14:editId="786AC01B">
           <wp:simplePos x="0" y="0"/>
           <wp:positionH relativeFrom="column">
-            <wp:posOffset>-552450</wp:posOffset>
+            <wp:posOffset>5547995</wp:posOffset>
           </wp:positionH>
           <wp:positionV relativeFrom="paragraph">
-            <wp:posOffset>114300</wp:posOffset>
+            <wp:posOffset>-114461</wp:posOffset>
+          </wp:positionV>
+          <wp:extent cx="773430" cy="818515"/>
+          <wp:effectExtent l="0" t="0" r="7620" b="635"/>
+          <wp:wrapSquare wrapText="bothSides"/>
+          <wp:docPr id="1529731186" name="image2.jpg"/>
+          <wp:cNvGraphicFramePr>
+            <a:graphicFrameLocks xmlns:a="http://schemas.openxmlformats.org/drawingml/2006/main" noChangeAspect="1"/>
+          </wp:cNvGraphicFramePr>
+          <a:graphic xmlns:a="http://schemas.openxmlformats.org/drawingml/2006/main">
+            <a:graphicData uri="http://schemas.openxmlformats.org/drawingml/2006/picture">
+              <pic:pic xmlns:pic="http://schemas.openxmlformats.org/drawingml/2006/picture">
+                <pic:nvPicPr>
+                  <pic:cNvPr id="1" name="image2.jpg"/>
+                  <pic:cNvPicPr>
+                    <a:picLocks noChangeAspect="1" noChangeArrowheads="1"/>
+                  </pic:cNvPicPr>
+                </pic:nvPicPr>
+                <pic:blipFill rotWithShape="1">
+                  <a:blip r:embed="rId1">
+                    <a:extLst>
+                      <a:ext uri="{28A0092B-C50C-407E-A947-70E740481C1C}">
+                        <a14:useLocalDpi xmlns:a14="http://schemas.microsoft.com/office/drawing/2010/main" val="0"/>
+                      </a:ext>
+                    </a:extLst>
+                  </a:blip>
+                  <a:srcRect b="16667"/>
+                  <a:stretch>
+                    <a:fillRect/>
+                  </a:stretch>
+                </pic:blipFill>
+                <pic:spPr bwMode="auto">
+                  <a:xfrm>
+                    <a:off x="0" y="0"/>
+                    <a:ext cx="773430" cy="818515"/>
+                  </a:xfrm>
+                  <a:prstGeom prst="rect">
+                    <a:avLst/>
+                  </a:prstGeom>
+                  <a:noFill/>
+                  <a:ln>
+                    <a:noFill/>
+                  </a:ln>
+                  <a:extLst>
+                    <a:ext uri="{53640926-AAD7-44D8-BBD7-CCE9431645EC}">
+                      <a14:shadowObscured xmlns:a14="http://schemas.microsoft.com/office/drawing/2010/main"/>
+                    </a:ext>
+                  </a:extLst>
+                </pic:spPr>
+              </pic:pic>
+            </a:graphicData>
+          </a:graphic>
+        </wp:anchor>
+      </w:drawing>
+    </w:r>
+    <w:r>
+      <w:rPr>
+        <w:b/>
+        <w:sz w:val="26"/>
+        <w:szCs w:val="26"/>
+      </w:rPr>
+      <w:drawing>
+        <wp:anchor distT="114300" distB="114300" distL="114300" distR="114300" simplePos="0" relativeHeight="251659264" behindDoc="0" locked="0" layoutInCell="1" hidden="0" allowOverlap="1" wp14:anchorId="2ECF29DA" wp14:editId="3437FBA6">
+          <wp:simplePos x="0" y="0"/>
+          <wp:positionH relativeFrom="column">
+            <wp:posOffset>-402325</wp:posOffset>
+          </wp:positionH>
+          <wp:positionV relativeFrom="paragraph">
+            <wp:posOffset>-97240</wp:posOffset>
           </wp:positionV>
           <wp:extent cx="723900" cy="762000"/>
           <wp:effectExtent l="0" t="0" r="0" b="0"/>
@@ -32431,7 +32715,7 @@
                   <pic:cNvPicPr preferRelativeResize="0"/>
                 </pic:nvPicPr>
                 <pic:blipFill>
-                  <a:blip r:embed="rId1"/>
+                  <a:blip r:embed="rId2"/>
                   <a:srcRect/>
                   <a:stretch>
                     <a:fillRect/>
@@ -32459,23 +32743,21 @@
         </wp:anchor>
       </w:drawing>
     </w:r>
-  </w:p>
-  <w:p>
-    <w:pPr>
-      <w:jc w:val="center"/>
-      <w:rPr>
-        <w:b/>
-        <w:sz w:val="26"/>
-        <w:szCs w:val="26"/>
-      </w:rPr>
-    </w:pPr>
     <w:r>
       <w:rPr>
         <w:b/>
         <w:sz w:val="26"/>
         <w:szCs w:val="26"/>
       </w:rPr>
-      <w:t>НАЦИОНАЛНА ФИНАНСОВО-СТОПАНСКА ГИМНАЗИЯ</w:t>
+      <w:t>Н</w:t>
+    </w:r>
+    <w:r>
+      <w:rPr>
+        <w:b/>
+        <w:sz w:val="26"/>
+        <w:szCs w:val="26"/>
+      </w:rPr>
+      <w:t>АЦИОНАЛНА ФИНАНСОВО-СТОПАНСКА ГИМНАЗИЯ</w:t>
     </w:r>
   </w:p>
   <w:p>
@@ -32488,30 +32770,21 @@
   </w:p>
   <w:p>
     <w:pPr>
+      <w:tabs>
+        <w:tab w:val="right" w:pos="8719"/>
+      </w:tabs>
       <w:jc w:val="center"/>
     </w:pPr>
     <w:r>
       <w:t xml:space="preserve">e-mail: </w:t>
     </w:r>
-    <w:hyperlink r:id="rId2">
+    <w:hyperlink r:id="rId3">
       <w:r>
         <w:rPr>
           <w:color w:val="1155CC"/>
           <w:u w:val="single"/>
         </w:rPr>
         <w:t>nfsg.sofia@gmail.com</w:t>
-      </w:r>
-    </w:hyperlink>
-    <w:r>
-      <w:t xml:space="preserve">, </w:t>
-    </w:r>
-    <w:hyperlink r:id="rId3">
-      <w:r>
-        <w:rPr>
-          <w:color w:val="1155CC"/>
-          <w:u w:val="single"/>
-        </w:rPr>
-        <w:t>nfsg@nfsg-sofia.org</w:t>
       </w:r>
     </w:hyperlink>
     <w:r>
@@ -32523,23 +32796,35 @@
           <w:color w:val="1155CC"/>
           <w:u w:val="single"/>
         </w:rPr>
-        <w:t>info-2211420@edu.mon.bg</w:t>
+        <w:t>nfsg@nfsg-sofia.org</w:t>
       </w:r>
     </w:hyperlink>
     <w:r>
       <w:t xml:space="preserve">, </w:t>
     </w:r>
+    <w:hyperlink r:id="rId5">
+      <w:r>
+        <w:rPr>
+          <w:color w:val="1155CC"/>
+          <w:u w:val="single"/>
+        </w:rPr>
+        <w:t>info-2211420@edu.mon.bg</w:t>
+      </w:r>
+    </w:hyperlink>
+    <w:r>
+      <w:t>,</w:t>
+    </w:r>
   </w:p>
   <w:p>
     <w:pPr>
-      <w:jc w:val="both"/>
+      <w:jc w:val="center"/>
       <w:rPr>
         <w:lang w:val="en-US"/>
       </w:rPr>
     </w:pPr>
     <w:r>
       <w:pict w14:anchorId="7222E339">
-        <v:rect id="_x0000_i1025" style="width:0;height:1.5pt" o:hralign="center" o:hrstd="t" o:hr="t" fillcolor="#a0a0a0" stroked="f"/>
+        <v:rect id="_x0000_i1025" style="width:409.65pt;height:2pt" o:hrpct="871" o:hralign="center" o:hrstd="t" o:hr="t" fillcolor="#a0a0a0" stroked="f"/>
       </w:pict>
     </w:r>
   </w:p>

</xml_diff>